<commit_message>
Added tests to Lab9
</commit_message>
<xml_diff>
--- a/Lab11/Lab11_Kyrychenko.docx
+++ b/Lab11/Lab11_Kyrychenko.docx
@@ -1988,23 +1988,7 @@
           <w:szCs w:val="28"/>
           <w:lang w:val="uk-UA"/>
         </w:rPr>
-        <w:t xml:space="preserve">Рисунок </w:t>
-      </w:r>
-      <w:r>
-        <w:rPr>
-          <w:sz w:val="28"/>
-          <w:szCs w:val="28"/>
-          <w:lang w:val="uk-UA"/>
-        </w:rPr>
-        <w:t>5</w:t>
-      </w:r>
-      <w:r>
-        <w:rPr>
-          <w:sz w:val="28"/>
-          <w:szCs w:val="28"/>
-          <w:lang w:val="uk-UA"/>
-        </w:rPr>
-        <w:t xml:space="preserve"> – Результат виконання завдання 2</w:t>
+        <w:t>Рисунок 5 – Результат виконання завдання 2</w:t>
       </w:r>
     </w:p>
     <w:p>
@@ -2203,31 +2187,7 @@
           <w:szCs w:val="28"/>
           <w:lang w:val="uk-UA"/>
         </w:rPr>
-        <w:t xml:space="preserve">Рисунок </w:t>
-      </w:r>
-      <w:r>
-        <w:rPr>
-          <w:sz w:val="28"/>
-          <w:szCs w:val="28"/>
-          <w:lang w:val="uk-UA"/>
-        </w:rPr>
-        <w:t>6</w:t>
-      </w:r>
-      <w:r>
-        <w:rPr>
-          <w:sz w:val="28"/>
-          <w:szCs w:val="28"/>
-          <w:lang w:val="uk-UA"/>
-        </w:rPr>
-        <w:t xml:space="preserve"> – Результат виконання завдання </w:t>
-      </w:r>
-      <w:r>
-        <w:rPr>
-          <w:sz w:val="28"/>
-          <w:szCs w:val="28"/>
-          <w:lang w:val="uk-UA"/>
-        </w:rPr>
-        <w:t>3</w:t>
+        <w:t>Рисунок 6 – Результат виконання завдання 3</w:t>
       </w:r>
     </w:p>
     <w:p>
@@ -8232,6 +8192,7 @@
   <w:style w:type="character" w:default="1" w:styleId="DefaultParagraphFont">
     <w:name w:val="Default Paragraph Font"/>
     <w:uiPriority w:val="1"/>
+    <w:semiHidden/>
     <w:unhideWhenUsed/>
   </w:style>
   <w:style w:type="table" w:default="1" w:styleId="TableNormal">

</xml_diff>